<commit_message>
refactor: 统一为 date./form. 两种 Sheet 类型
</commit_message>
<xml_diff>
--- a/templates/报告模板.docx
+++ b/templates/报告模板.docx
@@ -164,7 +164,7 @@
               </w:rPr>
             </w:pPr>
             <w:r>
-              <w:t>{{ g.company_name }}</w:t>
+              <w:t>{{ date.公司名 }}</w:t>
             </w:r>
           </w:p>
         </w:tc>
@@ -226,7 +226,7 @@
               </w:rPr>
             </w:pPr>
             <w:r>
-              <w:t>{{ g.credit_code }}</w:t>
+              <w:t>{{ date.信用代码 }}</w:t>
             </w:r>
           </w:p>
         </w:tc>
@@ -288,7 +288,7 @@
               </w:rPr>
             </w:pPr>
             <w:r>
-              <w:t>{{ g.registered_address }}</w:t>
+              <w:t>{{ date.注册地址 }}</w:t>
             </w:r>
           </w:p>
         </w:tc>
@@ -350,7 +350,7 @@
               </w:rPr>
             </w:pPr>
             <w:r>
-              <w:t>{{ g.legal_representative }}</w:t>
+              <w:t>{{ date.法定代表人 }}</w:t>
             </w:r>
           </w:p>
         </w:tc>
@@ -412,7 +412,7 @@
               </w:rPr>
             </w:pPr>
             <w:r>
-              <w:t>{{ g.company_type }}</w:t>
+              <w:t>{{ date.公司类型 }}</w:t>
             </w:r>
           </w:p>
         </w:tc>
@@ -474,7 +474,7 @@
               </w:rPr>
             </w:pPr>
             <w:r>
-              <w:t>{{ g.registered_capital }}</w:t>
+              <w:t>{{ date.注册资本 }}</w:t>
             </w:r>
           </w:p>
         </w:tc>
@@ -536,7 +536,7 @@
               </w:rPr>
             </w:pPr>
             <w:r>
-              <w:t>{{ g.business_scope }}</w:t>
+              <w:t>{{ date.经营范围 }}</w:t>
             </w:r>
           </w:p>
         </w:tc>
@@ -598,7 +598,7 @@
               </w:rPr>
             </w:pPr>
             <w:r>
-              <w:t>{{ g.established_date }}</w:t>
+              <w:t>{{ date.成立日期 }}</w:t>
             </w:r>
           </w:p>
         </w:tc>
@@ -660,7 +660,7 @@
               </w:rPr>
             </w:pPr>
             <w:r>
-              <w:t>{{ g.operating_period }}</w:t>
+              <w:t>{{ date.经营期限 }}</w:t>
             </w:r>
           </w:p>
         </w:tc>
@@ -1013,7 +1013,7 @@
               </w:rPr>
             </w:pPr>
             <w:r>
-              <w:t>{%tr for sh in data.shareholders %}</w:t>
+              <w:t>{%tr for sh in form.股东出资 %}</w:t>
             </w:r>
           </w:p>
         </w:tc>
@@ -1109,7 +1109,7 @@
           </w:tcPr>
           <w:p>
             <w:r>
-              <w:t>{{ sh.shareholder_name }}</w:t>
+              <w:t>{{ sh.股东 }}</w:t>
             </w:r>
           </w:p>
         </w:tc>
@@ -1119,7 +1119,7 @@
           </w:tcPr>
           <w:p>
             <w:r>
-              <w:t>{{ sh.subscribed_amount }}</w:t>
+              <w:t>{{ sh.认缴金额 }}</w:t>
             </w:r>
           </w:p>
         </w:tc>
@@ -1129,7 +1129,7 @@
           </w:tcPr>
           <w:p>
             <w:r>
-              <w:t>{{ sh.subscribed_ratio }}</w:t>
+              <w:t>{{ sh.认缴比例 }}</w:t>
             </w:r>
           </w:p>
         </w:tc>
@@ -1139,7 +1139,7 @@
           </w:tcPr>
           <w:p>
             <w:r>
-              <w:t>{{ sh.paid_amount }}</w:t>
+              <w:t>{{ sh.实缴金额 }}</w:t>
             </w:r>
           </w:p>
         </w:tc>
@@ -1149,7 +1149,7 @@
           </w:tcPr>
           <w:p>
             <w:r>
-              <w:t>{{ sh.paid_ratio }}</w:t>
+              <w:t>{{ sh.实缴比例 }}</w:t>
             </w:r>
           </w:p>
         </w:tc>
@@ -1301,7 +1301,7 @@
           </w:tcPr>
           <w:p>
             <w:r>
-              <w:t>{%tr for si in data.shareholder_info %}</w:t>
+              <w:t>{%tr for si in form.股东信息 %}</w:t>
             </w:r>
           </w:p>
         </w:tc>
@@ -1319,7 +1319,7 @@
           </w:tcPr>
           <w:p>
             <w:r>
-              <w:t>{{ si.no }}</w:t>
+              <w:t>{{ si.序号 }}</w:t>
             </w:r>
           </w:p>
         </w:tc>
@@ -1329,7 +1329,7 @@
           </w:tcPr>
           <w:p>
             <w:r>
-              <w:t>{{ si.detail }}</w:t>
+              <w:t>{{ si.详情 }}</w:t>
             </w:r>
           </w:p>
         </w:tc>

</xml_diff>

<commit_message>
refactor: 消除 date/form 前缀，扁平化数据模型，拆分 src 为 reader/processing/render 三层
- 移除所有 date./form. 前缀：Sheet名直接作为context key，模板用 {{ Sheet名.字段 }}
- 移除旧格式兼容代码：reader 旧前缀检测、mapper _check_no_legacy_prefix
- mapper 新增 list 类型支持，YAML 列表数据不再被丢弃
- 拆分 src/ 目录：reader/ (xlsx+yaml+工厂函数) / processing/ (mapper+schema) / render/ (generator+filters)
- 同步更新 docs/ (用户指南/模板制作规范/开发手册) 和 tests/ (36/36 通过)
- .gitignore output/ 扩大到整个目录
</commit_message>
<xml_diff>
--- a/templates/报告模板.docx
+++ b/templates/报告模板.docx
@@ -4,12 +4,12 @@
   <w:body>
     <w:p>
       <w:r>
-        <w:t>公司名称：{{ date.全局信息.公司名 }}</w:t>
+        <w:t>公司名称：{{ 全局信息.公司名 }}</w:t>
       </w:r>
     </w:p>
     <w:p>
       <w:r>
-        <w:t>法定代表人：{{ date.基本情况.法定代表人 }}</w:t>
+        <w:t>法定代表人：{{ 基本情况.法定代表人 }}</w:t>
       </w:r>
     </w:p>
     <w:tbl>
@@ -62,7 +62,7 @@
           </w:tcPr>
           <w:p>
             <w:r>
-              <w:t>{%tr for i in form.项目列表 %}</w:t>
+              <w:t>{%tr for i in 项目列表 %}</w:t>
             </w:r>
           </w:p>
         </w:tc>

</xml_diff>